<commit_message>
finalised Sf4 Interim report
</commit_message>
<xml_diff>
--- a/SF4 Interim Report.docx
+++ b/SF4 Interim Report.docx
@@ -14,41 +14,53 @@
           <w:rFonts w:ascii="Calibri" w:hAnsi="Calibri" w:cs="Calibri"/>
           <w:u w:val="single"/>
         </w:rPr>
-        <w:t>SF4 – Datalogger Interim Report</w:t>
+        <w:t xml:space="preserve">SF4 – Datalogger Interim </w:t>
+      </w:r>
+      <w:r>
+        <w:rPr>
+          <w:rFonts w:ascii="Calibri" w:hAnsi="Calibri" w:cs="Calibri"/>
+          <w:u w:val="single"/>
+        </w:rPr>
+        <w:t>Report</w:t>
+      </w:r>
+      <w:r>
+        <w:rPr>
+          <w:rFonts w:ascii="Calibri" w:hAnsi="Calibri" w:cs="Calibri"/>
+        </w:rPr>
+        <w:t xml:space="preserve"> </w:t>
+      </w:r>
+      <w:r>
+        <w:rPr>
+          <w:rFonts w:ascii="Calibri" w:hAnsi="Calibri" w:cs="Calibri"/>
+        </w:rPr>
+        <w:t>Rahul</w:t>
+      </w:r>
+      <w:r>
+        <w:rPr>
+          <w:rFonts w:ascii="Calibri" w:hAnsi="Calibri" w:cs="Calibri"/>
+        </w:rPr>
+        <w:t xml:space="preserve"> Sharma rs2288 &amp; Owen Marlovits om399</w:t>
       </w:r>
     </w:p>
     <w:p>
       <w:pPr>
         <w:rPr>
           <w:rFonts w:ascii="Calibri" w:hAnsi="Calibri" w:cs="Calibri"/>
-        </w:rPr>
-      </w:pPr>
-      <w:r>
-        <w:rPr>
-          <w:rFonts w:ascii="Calibri" w:hAnsi="Calibri" w:cs="Calibri"/>
-        </w:rPr>
-        <w:t>Rahul Sharma rs2288 &amp; Owen Marlovits om399</w:t>
+          <w:u w:val="single"/>
+        </w:rPr>
+      </w:pPr>
+      <w:r>
+        <w:rPr>
+          <w:rFonts w:ascii="Calibri" w:hAnsi="Calibri" w:cs="Calibri"/>
+          <w:u w:val="single"/>
+        </w:rPr>
+        <w:t>Analogue Circuit Design</w:t>
       </w:r>
     </w:p>
     <w:p>
       <w:pPr>
         <w:rPr>
           <w:rFonts w:ascii="Calibri" w:hAnsi="Calibri" w:cs="Calibri"/>
-          <w:u w:val="single"/>
-        </w:rPr>
-      </w:pPr>
-      <w:r>
-        <w:rPr>
-          <w:rFonts w:ascii="Calibri" w:hAnsi="Calibri" w:cs="Calibri"/>
-          <w:u w:val="single"/>
-        </w:rPr>
-        <w:t>Analogue Circuit Design</w:t>
-      </w:r>
-    </w:p>
-    <w:p>
-      <w:pPr>
-        <w:rPr>
-          <w:rFonts w:ascii="Calibri" w:hAnsi="Calibri" w:cs="Calibri"/>
         </w:rPr>
       </w:pPr>
       <w:r>
@@ -56,10 +68,10 @@
           <w:rFonts w:ascii="Calibri" w:hAnsi="Calibri" w:cs="Calibri"/>
         </w:rPr>
         <w:drawing>
-          <wp:inline distT="0" distB="0" distL="0" distR="0" wp14:anchorId="291891EE" wp14:editId="503732DB">
-            <wp:extent cx="5207000" cy="3495947"/>
-            <wp:effectExtent l="0" t="0" r="0" b="9525"/>
-            <wp:docPr id="1024399429" name="Picture 1"/>
+          <wp:inline distT="0" distB="0" distL="0" distR="0" wp14:anchorId="05A37988" wp14:editId="2ED77354">
+            <wp:extent cx="5867400" cy="2902585"/>
+            <wp:effectExtent l="0" t="0" r="0" b="0"/>
+            <wp:docPr id="1632187009" name="Picture 1"/>
             <wp:cNvGraphicFramePr>
               <a:graphicFrameLocks xmlns:a="http://schemas.openxmlformats.org/drawingml/2006/main" noChangeAspect="1"/>
             </wp:cNvGraphicFramePr>
@@ -67,11 +79,11 @@
               <a:graphicData uri="http://schemas.openxmlformats.org/drawingml/2006/picture">
                 <pic:pic xmlns:pic="http://schemas.openxmlformats.org/drawingml/2006/picture">
                   <pic:nvPicPr>
-                    <pic:cNvPr id="1024399429" name=""/>
+                    <pic:cNvPr id="1632187009" name=""/>
                     <pic:cNvPicPr/>
                   </pic:nvPicPr>
                   <pic:blipFill>
-                    <a:blip r:embed="rId4"/>
+                    <a:blip r:embed="rId5"/>
                     <a:stretch>
                       <a:fillRect/>
                     </a:stretch>
@@ -79,7 +91,7 @@
                   <pic:spPr>
                     <a:xfrm>
                       <a:off x="0" y="0"/>
-                      <a:ext cx="5210556" cy="3498334"/>
+                      <a:ext cx="5880902" cy="2909264"/>
                     </a:xfrm>
                     <a:prstGeom prst="rect">
                       <a:avLst/>
@@ -96,27 +108,15 @@
       <w:pPr>
         <w:rPr>
           <w:rFonts w:ascii="Calibri" w:hAnsi="Calibri" w:cs="Calibri"/>
-        </w:rPr>
-      </w:pPr>
-      <w:r>
-        <w:rPr>
-          <w:rFonts w:ascii="Calibri" w:hAnsi="Calibri" w:cs="Calibri"/>
-        </w:rPr>
-        <w:t xml:space="preserve">The analogue circuit design is as above, this does not include connections between the MCP3304 and the Arduino as </w:t>
-      </w:r>
-      <w:proofErr w:type="spellStart"/>
-      <w:r>
-        <w:rPr>
-          <w:rFonts w:ascii="Calibri" w:hAnsi="Calibri" w:cs="Calibri"/>
-        </w:rPr>
-        <w:t>KiCad</w:t>
-      </w:r>
-      <w:proofErr w:type="spellEnd"/>
-      <w:r>
-        <w:rPr>
-          <w:rFonts w:ascii="Calibri" w:hAnsi="Calibri" w:cs="Calibri"/>
-        </w:rPr>
-        <w:t xml:space="preserve"> does not have an Arduino Symbol in their Schematics although this is just two connections for the SPI communication.</w:t>
+          <w:u w:val="single"/>
+        </w:rPr>
+      </w:pPr>
+      <w:r>
+        <w:rPr>
+          <w:rFonts w:ascii="Calibri" w:hAnsi="Calibri" w:cs="Calibri"/>
+          <w:u w:val="single"/>
+        </w:rPr>
+        <w:t>Hardware Block Diagram</w:t>
       </w:r>
     </w:p>
     <w:p>
@@ -124,46 +124,17 @@
         <w:rPr>
           <w:rFonts w:ascii="Calibri" w:hAnsi="Calibri" w:cs="Calibri"/>
           <w:u w:val="single"/>
-          <w:lang w:val="de-DE"/>
         </w:rPr>
       </w:pPr>
       <w:r>
         <w:rPr>
           <w:rFonts w:ascii="Calibri" w:hAnsi="Calibri" w:cs="Calibri"/>
           <w:u w:val="single"/>
-          <w:lang w:val="de-DE"/>
-        </w:rPr>
-        <w:t xml:space="preserve">Hardware Block </w:t>
-      </w:r>
-      <w:proofErr w:type="spellStart"/>
-      <w:r>
-        <w:rPr>
-          <w:rFonts w:ascii="Calibri" w:hAnsi="Calibri" w:cs="Calibri"/>
-          <w:u w:val="single"/>
-          <w:lang w:val="de-DE"/>
-        </w:rPr>
-        <w:t>Diagram</w:t>
-      </w:r>
-      <w:proofErr w:type="spellEnd"/>
-    </w:p>
-    <w:p>
-      <w:pPr>
-        <w:rPr>
-          <w:rFonts w:ascii="Calibri" w:hAnsi="Calibri" w:cs="Calibri"/>
-          <w:u w:val="single"/>
-          <w:lang w:val="de-DE"/>
-        </w:rPr>
-      </w:pPr>
-      <w:r>
-        <w:rPr>
-          <w:rFonts w:ascii="Calibri" w:hAnsi="Calibri" w:cs="Calibri"/>
-          <w:u w:val="single"/>
-          <w:lang w:val="de-DE"/>
         </w:rPr>
         <w:drawing>
-          <wp:inline distT="0" distB="0" distL="0" distR="0" wp14:anchorId="1E683F76" wp14:editId="2CF4B5CD">
-            <wp:extent cx="5731510" cy="1746250"/>
-            <wp:effectExtent l="0" t="0" r="2540" b="6350"/>
+          <wp:inline distT="0" distB="0" distL="0" distR="0" wp14:anchorId="1E683F76" wp14:editId="104492FC">
+            <wp:extent cx="4775200" cy="1454886"/>
+            <wp:effectExtent l="0" t="0" r="6350" b="0"/>
             <wp:docPr id="1261417881" name="Picture 1"/>
             <wp:cNvGraphicFramePr>
               <a:graphicFrameLocks xmlns:a="http://schemas.openxmlformats.org/drawingml/2006/main" noChangeAspect="1"/>
@@ -176,7 +147,7 @@
                     <pic:cNvPicPr/>
                   </pic:nvPicPr>
                   <pic:blipFill>
-                    <a:blip r:embed="rId5"/>
+                    <a:blip r:embed="rId6"/>
                     <a:stretch>
                       <a:fillRect/>
                     </a:stretch>
@@ -184,7 +155,7 @@
                   <pic:spPr>
                     <a:xfrm>
                       <a:off x="0" y="0"/>
-                      <a:ext cx="5731510" cy="1746250"/>
+                      <a:ext cx="4787703" cy="1458695"/>
                     </a:xfrm>
                     <a:prstGeom prst="rect">
                       <a:avLst/>
@@ -201,6 +172,38 @@
       <w:pPr>
         <w:rPr>
           <w:rFonts w:ascii="Calibri" w:hAnsi="Calibri" w:cs="Calibri"/>
+        </w:rPr>
+      </w:pPr>
+      <w:r>
+        <w:rPr>
+          <w:rFonts w:ascii="Calibri" w:hAnsi="Calibri" w:cs="Calibri"/>
+        </w:rPr>
+        <w:t>The Block diagram above only focuses on one channel but our final setup will have two, in which case they are identical and come together at the Analogue to Digital Converter</w:t>
+      </w:r>
+    </w:p>
+    <w:p>
+      <w:pPr>
+        <w:rPr>
+          <w:rFonts w:ascii="Calibri" w:hAnsi="Calibri" w:cs="Calibri"/>
+        </w:rPr>
+      </w:pPr>
+      <w:r>
+        <w:rPr>
+          <w:rFonts w:ascii="Calibri" w:hAnsi="Calibri" w:cs="Calibri"/>
+        </w:rPr>
+        <w:t>Due to a low s</w:t>
+      </w:r>
+      <w:r>
+        <w:rPr>
+          <w:rFonts w:ascii="Calibri" w:hAnsi="Calibri" w:cs="Calibri"/>
+        </w:rPr>
+        <w:t xml:space="preserve">ampling frequency and budget we have deemed oscilloscope probes unnecessary as crocodile clips should be sufficient for what we are doing. </w:t>
+      </w:r>
+    </w:p>
+    <w:p>
+      <w:pPr>
+        <w:rPr>
+          <w:rFonts w:ascii="Calibri" w:hAnsi="Calibri" w:cs="Calibri"/>
           <w:u w:val="single"/>
           <w:lang w:val="de-DE"/>
         </w:rPr>
@@ -211,7 +214,23 @@
           <w:u w:val="single"/>
           <w:lang w:val="de-DE"/>
         </w:rPr>
-        <w:t xml:space="preserve">Firmware Block </w:t>
+        <w:t>Firmware</w:t>
+      </w:r>
+      <w:r>
+        <w:rPr>
+          <w:rFonts w:ascii="Calibri" w:hAnsi="Calibri" w:cs="Calibri"/>
+          <w:u w:val="single"/>
+          <w:lang w:val="de-DE"/>
+        </w:rPr>
+        <w:t>/Software</w:t>
+      </w:r>
+      <w:r>
+        <w:rPr>
+          <w:rFonts w:ascii="Calibri" w:hAnsi="Calibri" w:cs="Calibri"/>
+          <w:u w:val="single"/>
+          <w:lang w:val="de-DE"/>
+        </w:rPr>
+        <w:t xml:space="preserve"> Block </w:t>
       </w:r>
       <w:proofErr w:type="spellStart"/>
       <w:r>
@@ -232,6 +251,57 @@
           <w:lang w:val="de-DE"/>
         </w:rPr>
       </w:pPr>
+      <w:r>
+        <w:rPr>
+          <w:rFonts w:ascii="Calibri" w:hAnsi="Calibri" w:cs="Calibri"/>
+          <w:u w:val="single"/>
+          <w:lang w:val="de-DE"/>
+        </w:rPr>
+        <w:drawing>
+          <wp:inline distT="0" distB="0" distL="0" distR="0" wp14:anchorId="28B45471" wp14:editId="1CF7AE47">
+            <wp:extent cx="4464050" cy="2009230"/>
+            <wp:effectExtent l="0" t="0" r="0" b="0"/>
+            <wp:docPr id="1412737347" name="Picture 1"/>
+            <wp:cNvGraphicFramePr>
+              <a:graphicFrameLocks xmlns:a="http://schemas.openxmlformats.org/drawingml/2006/main" noChangeAspect="1"/>
+            </wp:cNvGraphicFramePr>
+            <a:graphic xmlns:a="http://schemas.openxmlformats.org/drawingml/2006/main">
+              <a:graphicData uri="http://schemas.openxmlformats.org/drawingml/2006/picture">
+                <pic:pic xmlns:pic="http://schemas.openxmlformats.org/drawingml/2006/picture">
+                  <pic:nvPicPr>
+                    <pic:cNvPr id="1412737347" name=""/>
+                    <pic:cNvPicPr/>
+                  </pic:nvPicPr>
+                  <pic:blipFill rotWithShape="1">
+                    <a:blip r:embed="rId7"/>
+                    <a:srcRect l="2770" t="7029" b="3401"/>
+                    <a:stretch>
+                      <a:fillRect/>
+                    </a:stretch>
+                  </pic:blipFill>
+                  <pic:spPr bwMode="auto">
+                    <a:xfrm>
+                      <a:off x="0" y="0"/>
+                      <a:ext cx="4474917" cy="2014121"/>
+                    </a:xfrm>
+                    <a:prstGeom prst="rect">
+                      <a:avLst/>
+                    </a:prstGeom>
+                    <a:ln>
+                      <a:noFill/>
+                    </a:ln>
+                    <a:extLst>
+                      <a:ext uri="{53640926-AAD7-44D8-BBD7-CCE9431645EC}">
+                        <a14:shadowObscured xmlns:a14="http://schemas.microsoft.com/office/drawing/2010/main"/>
+                      </a:ext>
+                    </a:extLst>
+                  </pic:spPr>
+                </pic:pic>
+              </a:graphicData>
+            </a:graphic>
+          </wp:inline>
+        </w:drawing>
+      </w:r>
     </w:p>
     <w:p>
       <w:pPr>
@@ -245,15 +315,218 @@
           <w:rFonts w:ascii="Calibri" w:hAnsi="Calibri" w:cs="Calibri"/>
           <w:u w:val="single"/>
         </w:rPr>
+        <w:lastRenderedPageBreak/>
         <w:t>Software Design</w:t>
+      </w:r>
+      <w:r>
+        <w:rPr>
+          <w:rFonts w:ascii="Calibri" w:hAnsi="Calibri" w:cs="Calibri"/>
+          <w:u w:val="single"/>
+        </w:rPr>
+        <w:t>/Features</w:t>
       </w:r>
     </w:p>
     <w:p>
       <w:pPr>
-        <w:rPr>
-          <w:rFonts w:ascii="Calibri" w:hAnsi="Calibri" w:cs="Calibri"/>
-        </w:rPr>
-      </w:pPr>
+        <w:pStyle w:val="ListParagraph"/>
+        <w:numPr>
+          <w:ilvl w:val="0"/>
+          <w:numId w:val="1"/>
+        </w:numPr>
+        <w:rPr>
+          <w:rFonts w:ascii="Calibri" w:hAnsi="Calibri" w:cs="Calibri"/>
+        </w:rPr>
+      </w:pPr>
+      <w:r>
+        <w:rPr>
+          <w:rFonts w:ascii="Calibri" w:hAnsi="Calibri" w:cs="Calibri"/>
+        </w:rPr>
+        <w:t>User Interface for controlling attenuation and coupling</w:t>
+      </w:r>
+    </w:p>
+    <w:p>
+      <w:pPr>
+        <w:pStyle w:val="ListParagraph"/>
+        <w:numPr>
+          <w:ilvl w:val="0"/>
+          <w:numId w:val="1"/>
+        </w:numPr>
+        <w:rPr>
+          <w:rFonts w:ascii="Calibri" w:hAnsi="Calibri" w:cs="Calibri"/>
+        </w:rPr>
+      </w:pPr>
+      <w:r>
+        <w:rPr>
+          <w:rFonts w:ascii="Calibri" w:hAnsi="Calibri" w:cs="Calibri"/>
+        </w:rPr>
+        <w:t>Continuous Time and Frequency representation of signals</w:t>
+      </w:r>
+    </w:p>
+    <w:p>
+      <w:pPr>
+        <w:pStyle w:val="ListParagraph"/>
+        <w:numPr>
+          <w:ilvl w:val="0"/>
+          <w:numId w:val="1"/>
+        </w:numPr>
+        <w:rPr>
+          <w:rFonts w:ascii="Calibri" w:hAnsi="Calibri" w:cs="Calibri"/>
+        </w:rPr>
+      </w:pPr>
+      <w:r>
+        <w:rPr>
+          <w:rFonts w:ascii="Calibri" w:hAnsi="Calibri" w:cs="Calibri"/>
+        </w:rPr>
+        <w:t>Automatic and Manual triggering</w:t>
+      </w:r>
+    </w:p>
+    <w:p>
+      <w:pPr>
+        <w:pStyle w:val="ListParagraph"/>
+        <w:numPr>
+          <w:ilvl w:val="0"/>
+          <w:numId w:val="1"/>
+        </w:numPr>
+        <w:rPr>
+          <w:rFonts w:ascii="Calibri" w:hAnsi="Calibri" w:cs="Calibri"/>
+        </w:rPr>
+      </w:pPr>
+      <w:r>
+        <w:rPr>
+          <w:rFonts w:ascii="Calibri" w:hAnsi="Calibri" w:cs="Calibri"/>
+        </w:rPr>
+        <w:t xml:space="preserve">Period, RMS, </w:t>
+      </w:r>
+      <w:proofErr w:type="spellStart"/>
+      <w:r>
+        <w:rPr>
+          <w:rFonts w:ascii="Calibri" w:hAnsi="Calibri" w:cs="Calibri"/>
+        </w:rPr>
+        <w:t>V</w:t>
+      </w:r>
+      <w:r>
+        <w:rPr>
+          <w:rFonts w:ascii="Calibri" w:hAnsi="Calibri" w:cs="Calibri"/>
+          <w:vertAlign w:val="subscript"/>
+        </w:rPr>
+        <w:t>pp</w:t>
+      </w:r>
+      <w:proofErr w:type="spellEnd"/>
+      <w:r>
+        <w:rPr>
+          <w:rFonts w:ascii="Calibri" w:hAnsi="Calibri" w:cs="Calibri"/>
+          <w:vertAlign w:val="subscript"/>
+        </w:rPr>
+        <w:t xml:space="preserve"> </w:t>
+      </w:r>
+      <w:r>
+        <w:rPr>
+          <w:rFonts w:ascii="Calibri" w:hAnsi="Calibri" w:cs="Calibri"/>
+        </w:rPr>
+        <w:t>,</w:t>
+      </w:r>
+      <w:proofErr w:type="spellStart"/>
+      <w:r>
+        <w:rPr>
+          <w:rFonts w:ascii="Calibri" w:hAnsi="Calibri" w:cs="Calibri"/>
+        </w:rPr>
+        <w:t>V</w:t>
+      </w:r>
+      <w:r>
+        <w:rPr>
+          <w:rFonts w:ascii="Calibri" w:hAnsi="Calibri" w:cs="Calibri"/>
+          <w:vertAlign w:val="subscript"/>
+        </w:rPr>
+        <w:t>avg</w:t>
+      </w:r>
+      <w:proofErr w:type="spellEnd"/>
+      <w:r>
+        <w:rPr>
+          <w:rFonts w:ascii="Calibri" w:hAnsi="Calibri" w:cs="Calibri"/>
+        </w:rPr>
+        <w:t xml:space="preserve"> measurements.</w:t>
+      </w:r>
+    </w:p>
+    <w:p>
+      <w:pPr>
+        <w:pStyle w:val="ListParagraph"/>
+        <w:numPr>
+          <w:ilvl w:val="0"/>
+          <w:numId w:val="1"/>
+        </w:numPr>
+        <w:rPr>
+          <w:rFonts w:ascii="Calibri" w:hAnsi="Calibri" w:cs="Calibri"/>
+        </w:rPr>
+      </w:pPr>
+      <w:r>
+        <w:rPr>
+          <w:rFonts w:ascii="Calibri" w:hAnsi="Calibri" w:cs="Calibri"/>
+        </w:rPr>
+        <w:t xml:space="preserve">Mathematical functions between channels </w:t>
+      </w:r>
+      <w:proofErr w:type="spellStart"/>
+      <w:r>
+        <w:rPr>
+          <w:rFonts w:ascii="Calibri" w:hAnsi="Calibri" w:cs="Calibri"/>
+        </w:rPr>
+        <w:t>ie</w:t>
+      </w:r>
+      <w:proofErr w:type="spellEnd"/>
+      <w:r>
+        <w:rPr>
+          <w:rFonts w:ascii="Calibri" w:hAnsi="Calibri" w:cs="Calibri"/>
+        </w:rPr>
+        <w:t xml:space="preserve"> multiplication and division.</w:t>
+      </w:r>
+    </w:p>
+    <w:p>
+      <w:pPr>
+        <w:pStyle w:val="ListParagraph"/>
+        <w:numPr>
+          <w:ilvl w:val="0"/>
+          <w:numId w:val="1"/>
+        </w:numPr>
+        <w:rPr>
+          <w:rFonts w:ascii="Calibri" w:hAnsi="Calibri" w:cs="Calibri"/>
+        </w:rPr>
+      </w:pPr>
+      <w:r>
+        <w:rPr>
+          <w:rFonts w:ascii="Calibri" w:hAnsi="Calibri" w:cs="Calibri"/>
+        </w:rPr>
+        <w:t>THD and SNR Calculations</w:t>
+      </w:r>
+    </w:p>
+    <w:p>
+      <w:pPr>
+        <w:pStyle w:val="ListParagraph"/>
+        <w:numPr>
+          <w:ilvl w:val="0"/>
+          <w:numId w:val="1"/>
+        </w:numPr>
+        <w:rPr>
+          <w:rFonts w:ascii="Calibri" w:hAnsi="Calibri" w:cs="Calibri"/>
+        </w:rPr>
+      </w:pPr>
+      <w:r>
+        <w:rPr>
+          <w:rFonts w:ascii="Calibri" w:hAnsi="Calibri" w:cs="Calibri"/>
+        </w:rPr>
+        <w:t>Total Power</w:t>
+      </w:r>
+    </w:p>
+    <w:p>
+      <w:pPr>
+        <w:rPr>
+          <w:rFonts w:ascii="Calibri" w:hAnsi="Calibri" w:cs="Calibri"/>
+        </w:rPr>
+      </w:pPr>
+      <w:r>
+        <w:rPr>
+          <w:rFonts w:ascii="Calibri" w:hAnsi="Calibri" w:cs="Calibri"/>
+        </w:rPr>
+        <w:t>ADC limited to 100KSps but SPI is a bottleneck so aiming for 20KSps</w:t>
+      </w:r>
     </w:p>
     <w:p>
       <w:pPr>
@@ -273,38 +546,56 @@
     <w:tbl>
       <w:tblPr>
         <w:tblStyle w:val="TableGrid"/>
-        <w:tblW w:w="0" w:type="auto"/>
+        <w:tblW w:w="9493" w:type="dxa"/>
         <w:tblLook w:val="04A0" w:firstRow="1" w:lastRow="0" w:firstColumn="1" w:lastColumn="0" w:noHBand="0" w:noVBand="1"/>
       </w:tblPr>
       <w:tblGrid>
-        <w:gridCol w:w="5807"/>
-        <w:gridCol w:w="1134"/>
-        <w:gridCol w:w="992"/>
-        <w:gridCol w:w="1083"/>
+        <w:gridCol w:w="1271"/>
+        <w:gridCol w:w="4924"/>
+        <w:gridCol w:w="1075"/>
+        <w:gridCol w:w="788"/>
+        <w:gridCol w:w="1435"/>
       </w:tblGrid>
       <w:tr>
         <w:tc>
           <w:tcPr>
-            <w:tcW w:w="5807" w:type="dxa"/>
-          </w:tcPr>
-          <w:p>
-            <w:pPr>
-              <w:rPr>
-                <w:rFonts w:ascii="Calibri" w:hAnsi="Calibri" w:cs="Calibri"/>
-              </w:rPr>
-            </w:pPr>
-            <w:r>
-              <w:rPr>
-                <w:rFonts w:ascii="Calibri" w:hAnsi="Calibri" w:cs="Calibri"/>
-              </w:rPr>
-              <w:lastRenderedPageBreak/>
+            <w:tcW w:w="1271" w:type="dxa"/>
+          </w:tcPr>
+          <w:p>
+            <w:pPr>
+              <w:rPr>
+                <w:rFonts w:ascii="Calibri" w:hAnsi="Calibri" w:cs="Calibri"/>
+              </w:rPr>
+            </w:pPr>
+            <w:r>
+              <w:rPr>
+                <w:rFonts w:ascii="Calibri" w:hAnsi="Calibri" w:cs="Calibri"/>
+              </w:rPr>
+              <w:t>Order Code</w:t>
+            </w:r>
+          </w:p>
+        </w:tc>
+        <w:tc>
+          <w:tcPr>
+            <w:tcW w:w="4924" w:type="dxa"/>
+          </w:tcPr>
+          <w:p>
+            <w:pPr>
+              <w:rPr>
+                <w:rFonts w:ascii="Calibri" w:hAnsi="Calibri" w:cs="Calibri"/>
+              </w:rPr>
+            </w:pPr>
+            <w:r>
+              <w:rPr>
+                <w:rFonts w:ascii="Calibri" w:hAnsi="Calibri" w:cs="Calibri"/>
+              </w:rPr>
               <w:t>Part Name</w:t>
             </w:r>
           </w:p>
         </w:tc>
         <w:tc>
           <w:tcPr>
-            <w:tcW w:w="1134" w:type="dxa"/>
+            <w:tcW w:w="1075" w:type="dxa"/>
           </w:tcPr>
           <w:p>
             <w:pPr>
@@ -322,7 +613,7 @@
         </w:tc>
         <w:tc>
           <w:tcPr>
-            <w:tcW w:w="992" w:type="dxa"/>
+            <w:tcW w:w="788" w:type="dxa"/>
           </w:tcPr>
           <w:p>
             <w:pPr>
@@ -340,7 +631,7 @@
         </w:tc>
         <w:tc>
           <w:tcPr>
-            <w:tcW w:w="1083" w:type="dxa"/>
+            <w:tcW w:w="1435" w:type="dxa"/>
           </w:tcPr>
           <w:p>
             <w:pPr>
@@ -360,7 +651,25 @@
       <w:tr>
         <w:tc>
           <w:tcPr>
-            <w:tcW w:w="5807" w:type="dxa"/>
+            <w:tcW w:w="1271" w:type="dxa"/>
+          </w:tcPr>
+          <w:p>
+            <w:pPr>
+              <w:rPr>
+                <w:rFonts w:ascii="Calibri" w:hAnsi="Calibri" w:cs="Calibri"/>
+              </w:rPr>
+            </w:pPr>
+            <w:r>
+              <w:rPr>
+                <w:rFonts w:ascii="Calibri" w:hAnsi="Calibri" w:cs="Calibri"/>
+              </w:rPr>
+              <w:t>1292235</w:t>
+            </w:r>
+          </w:p>
+        </w:tc>
+        <w:tc>
+          <w:tcPr>
+            <w:tcW w:w="4924" w:type="dxa"/>
           </w:tcPr>
           <w:p>
             <w:pPr>
@@ -378,7 +687,7 @@
         </w:tc>
         <w:tc>
           <w:tcPr>
-            <w:tcW w:w="1134" w:type="dxa"/>
+            <w:tcW w:w="1075" w:type="dxa"/>
           </w:tcPr>
           <w:p>
             <w:pPr>
@@ -396,7 +705,7 @@
         </w:tc>
         <w:tc>
           <w:tcPr>
-            <w:tcW w:w="992" w:type="dxa"/>
+            <w:tcW w:w="788" w:type="dxa"/>
           </w:tcPr>
           <w:p>
             <w:pPr>
@@ -414,7 +723,7 @@
         </w:tc>
         <w:tc>
           <w:tcPr>
-            <w:tcW w:w="1083" w:type="dxa"/>
+            <w:tcW w:w="1435" w:type="dxa"/>
           </w:tcPr>
           <w:p>
             <w:pPr>
@@ -434,7 +743,25 @@
       <w:tr>
         <w:tc>
           <w:tcPr>
-            <w:tcW w:w="5807" w:type="dxa"/>
+            <w:tcW w:w="1271" w:type="dxa"/>
+          </w:tcPr>
+          <w:p>
+            <w:pPr>
+              <w:rPr>
+                <w:rFonts w:ascii="Calibri" w:hAnsi="Calibri" w:cs="Calibri"/>
+              </w:rPr>
+            </w:pPr>
+            <w:r>
+              <w:rPr>
+                <w:rFonts w:ascii="Calibri" w:hAnsi="Calibri" w:cs="Calibri"/>
+              </w:rPr>
+              <w:t>1605571</w:t>
+            </w:r>
+          </w:p>
+        </w:tc>
+        <w:tc>
+          <w:tcPr>
+            <w:tcW w:w="4924" w:type="dxa"/>
           </w:tcPr>
           <w:p>
             <w:pPr>
@@ -448,45 +775,50 @@
                 <w:rFonts w:ascii="Calibri" w:hAnsi="Calibri" w:cs="Calibri"/>
                 <w:lang w:val="nl-NL"/>
               </w:rPr>
-              <w:t>MCP6004-I/P Op Amp</w:t>
-            </w:r>
-          </w:p>
-        </w:tc>
-        <w:tc>
-          <w:tcPr>
-            <w:tcW w:w="1134" w:type="dxa"/>
-          </w:tcPr>
-          <w:p>
-            <w:pPr>
+              <w:t xml:space="preserve">MCP6004-I/P Op </w:t>
+            </w:r>
+            <w:proofErr w:type="spellStart"/>
+            <w:r>
               <w:rPr>
                 <w:rFonts w:ascii="Calibri" w:hAnsi="Calibri" w:cs="Calibri"/>
                 <w:lang w:val="nl-NL"/>
               </w:rPr>
-            </w:pPr>
-            <w:r>
-              <w:rPr>
-                <w:rFonts w:ascii="Calibri" w:hAnsi="Calibri" w:cs="Calibri"/>
-                <w:lang w:val="nl-NL"/>
-              </w:rPr>
-              <w:t>4</w:t>
-            </w:r>
-          </w:p>
-        </w:tc>
-        <w:tc>
-          <w:tcPr>
-            <w:tcW w:w="992" w:type="dxa"/>
-          </w:tcPr>
-          <w:p>
-            <w:pPr>
-              <w:rPr>
-                <w:rFonts w:ascii="Calibri" w:hAnsi="Calibri" w:cs="Calibri"/>
-                <w:lang w:val="nl-NL"/>
-              </w:rPr>
-            </w:pPr>
-            <w:r>
-              <w:rPr>
-                <w:rFonts w:ascii="Calibri" w:hAnsi="Calibri" w:cs="Calibri"/>
-                <w:lang w:val="nl-NL"/>
+              <w:t>Amp</w:t>
+            </w:r>
+            <w:proofErr w:type="spellEnd"/>
+          </w:p>
+        </w:tc>
+        <w:tc>
+          <w:tcPr>
+            <w:tcW w:w="1075" w:type="dxa"/>
+          </w:tcPr>
+          <w:p>
+            <w:pPr>
+              <w:rPr>
+                <w:rFonts w:ascii="Calibri" w:hAnsi="Calibri" w:cs="Calibri"/>
+              </w:rPr>
+            </w:pPr>
+            <w:r>
+              <w:rPr>
+                <w:rFonts w:ascii="Calibri" w:hAnsi="Calibri" w:cs="Calibri"/>
+              </w:rPr>
+              <w:t>1</w:t>
+            </w:r>
+          </w:p>
+        </w:tc>
+        <w:tc>
+          <w:tcPr>
+            <w:tcW w:w="788" w:type="dxa"/>
+          </w:tcPr>
+          <w:p>
+            <w:pPr>
+              <w:rPr>
+                <w:rFonts w:ascii="Calibri" w:hAnsi="Calibri" w:cs="Calibri"/>
+              </w:rPr>
+            </w:pPr>
+            <w:r>
+              <w:rPr>
+                <w:rFonts w:ascii="Calibri" w:hAnsi="Calibri" w:cs="Calibri"/>
               </w:rPr>
               <w:t>0.46</w:t>
             </w:r>
@@ -494,21 +826,19 @@
         </w:tc>
         <w:tc>
           <w:tcPr>
-            <w:tcW w:w="1083" w:type="dxa"/>
-          </w:tcPr>
-          <w:p>
-            <w:pPr>
-              <w:rPr>
-                <w:rFonts w:ascii="Calibri" w:hAnsi="Calibri" w:cs="Calibri"/>
-                <w:lang w:val="nl-NL"/>
-              </w:rPr>
-            </w:pPr>
-            <w:r>
-              <w:rPr>
-                <w:rFonts w:ascii="Calibri" w:hAnsi="Calibri" w:cs="Calibri"/>
-                <w:lang w:val="nl-NL"/>
-              </w:rPr>
-              <w:t>1.84</w:t>
+            <w:tcW w:w="1435" w:type="dxa"/>
+          </w:tcPr>
+          <w:p>
+            <w:pPr>
+              <w:rPr>
+                <w:rFonts w:ascii="Calibri" w:hAnsi="Calibri" w:cs="Calibri"/>
+              </w:rPr>
+            </w:pPr>
+            <w:r>
+              <w:rPr>
+                <w:rFonts w:ascii="Calibri" w:hAnsi="Calibri" w:cs="Calibri"/>
+              </w:rPr>
+              <w:t>0.46</w:t>
             </w:r>
           </w:p>
         </w:tc>
@@ -516,88 +846,91 @@
       <w:tr>
         <w:tc>
           <w:tcPr>
-            <w:tcW w:w="5807" w:type="dxa"/>
-          </w:tcPr>
-          <w:p>
-            <w:pPr>
-              <w:rPr>
-                <w:rFonts w:ascii="Calibri" w:hAnsi="Calibri" w:cs="Calibri"/>
-                <w:lang w:val="it-IT"/>
-              </w:rPr>
-            </w:pPr>
-            <w:r>
-              <w:rPr>
-                <w:rFonts w:ascii="Calibri" w:hAnsi="Calibri" w:cs="Calibri"/>
-                <w:lang w:val="it-IT"/>
-              </w:rPr>
-              <w:t>2N7000-D26z N Channel MO</w:t>
-            </w:r>
-            <w:r>
-              <w:rPr>
-                <w:rFonts w:ascii="Calibri" w:hAnsi="Calibri" w:cs="Calibri"/>
-                <w:lang w:val="it-IT"/>
-              </w:rPr>
-              <w:t>SFET</w:t>
-            </w:r>
-          </w:p>
-        </w:tc>
-        <w:tc>
-          <w:tcPr>
-            <w:tcW w:w="1134" w:type="dxa"/>
-          </w:tcPr>
-          <w:p>
-            <w:pPr>
-              <w:rPr>
-                <w:rFonts w:ascii="Calibri" w:hAnsi="Calibri" w:cs="Calibri"/>
-                <w:lang w:val="it-IT"/>
-              </w:rPr>
-            </w:pPr>
-            <w:r>
-              <w:rPr>
-                <w:rFonts w:ascii="Calibri" w:hAnsi="Calibri" w:cs="Calibri"/>
-                <w:lang w:val="it-IT"/>
-              </w:rPr>
-              <w:t>8</w:t>
-            </w:r>
-          </w:p>
-        </w:tc>
-        <w:tc>
-          <w:tcPr>
-            <w:tcW w:w="992" w:type="dxa"/>
-          </w:tcPr>
-          <w:p>
-            <w:pPr>
-              <w:rPr>
-                <w:rFonts w:ascii="Calibri" w:hAnsi="Calibri" w:cs="Calibri"/>
-                <w:lang w:val="it-IT"/>
-              </w:rPr>
-            </w:pPr>
-            <w:r>
-              <w:rPr>
-                <w:rFonts w:ascii="Calibri" w:hAnsi="Calibri" w:cs="Calibri"/>
-                <w:lang w:val="it-IT"/>
-              </w:rPr>
-              <w:t>0.14</w:t>
-            </w:r>
-          </w:p>
-        </w:tc>
-        <w:tc>
-          <w:tcPr>
-            <w:tcW w:w="1083" w:type="dxa"/>
-          </w:tcPr>
-          <w:p>
-            <w:pPr>
-              <w:rPr>
-                <w:rFonts w:ascii="Calibri" w:hAnsi="Calibri" w:cs="Calibri"/>
-                <w:lang w:val="it-IT"/>
-              </w:rPr>
-            </w:pPr>
-            <w:r>
-              <w:rPr>
-                <w:rFonts w:ascii="Calibri" w:hAnsi="Calibri" w:cs="Calibri"/>
-                <w:lang w:val="it-IT"/>
-              </w:rPr>
-              <w:t>1.12</w:t>
+            <w:tcW w:w="1271" w:type="dxa"/>
+          </w:tcPr>
+          <w:p>
+            <w:pPr>
+              <w:rPr>
+                <w:rFonts w:ascii="Calibri" w:hAnsi="Calibri" w:cs="Calibri"/>
+              </w:rPr>
+            </w:pPr>
+            <w:r>
+              <w:rPr>
+                <w:rFonts w:ascii="Calibri" w:hAnsi="Calibri" w:cs="Calibri"/>
+              </w:rPr>
+              <w:t>1852026</w:t>
+            </w:r>
+          </w:p>
+        </w:tc>
+        <w:tc>
+          <w:tcPr>
+            <w:tcW w:w="4924" w:type="dxa"/>
+          </w:tcPr>
+          <w:p>
+            <w:pPr>
+              <w:rPr>
+                <w:rFonts w:ascii="Calibri" w:hAnsi="Calibri" w:cs="Calibri"/>
+              </w:rPr>
+            </w:pPr>
+            <w:r>
+              <w:rPr>
+                <w:rFonts w:ascii="Calibri" w:hAnsi="Calibri" w:cs="Calibri"/>
+              </w:rPr>
+              <w:t xml:space="preserve">MCP3304-BI/SL Analogue to Digital Converter </w:t>
+            </w:r>
+          </w:p>
+        </w:tc>
+        <w:tc>
+          <w:tcPr>
+            <w:tcW w:w="1075" w:type="dxa"/>
+          </w:tcPr>
+          <w:p>
+            <w:pPr>
+              <w:rPr>
+                <w:rFonts w:ascii="Calibri" w:hAnsi="Calibri" w:cs="Calibri"/>
+              </w:rPr>
+            </w:pPr>
+            <w:r>
+              <w:rPr>
+                <w:rFonts w:ascii="Calibri" w:hAnsi="Calibri" w:cs="Calibri"/>
+              </w:rPr>
+              <w:t>1</w:t>
+            </w:r>
+          </w:p>
+        </w:tc>
+        <w:tc>
+          <w:tcPr>
+            <w:tcW w:w="788" w:type="dxa"/>
+          </w:tcPr>
+          <w:p>
+            <w:pPr>
+              <w:rPr>
+                <w:rFonts w:ascii="Calibri" w:hAnsi="Calibri" w:cs="Calibri"/>
+              </w:rPr>
+            </w:pPr>
+            <w:r>
+              <w:rPr>
+                <w:rFonts w:ascii="Calibri" w:hAnsi="Calibri" w:cs="Calibri"/>
+              </w:rPr>
+              <w:t>4.26</w:t>
+            </w:r>
+          </w:p>
+        </w:tc>
+        <w:tc>
+          <w:tcPr>
+            <w:tcW w:w="1435" w:type="dxa"/>
+          </w:tcPr>
+          <w:p>
+            <w:pPr>
+              <w:rPr>
+                <w:rFonts w:ascii="Calibri" w:hAnsi="Calibri" w:cs="Calibri"/>
+              </w:rPr>
+            </w:pPr>
+            <w:r>
+              <w:rPr>
+                <w:rFonts w:ascii="Calibri" w:hAnsi="Calibri" w:cs="Calibri"/>
+              </w:rPr>
+              <w:t>4.26</w:t>
             </w:r>
           </w:p>
         </w:tc>
@@ -605,94 +938,53 @@
       <w:tr>
         <w:tc>
           <w:tcPr>
-            <w:tcW w:w="5807" w:type="dxa"/>
-          </w:tcPr>
-          <w:p>
-            <w:pPr>
-              <w:rPr>
-                <w:rFonts w:ascii="Calibri" w:hAnsi="Calibri" w:cs="Calibri"/>
-                <w:lang w:val="es-ES"/>
-              </w:rPr>
-            </w:pPr>
-            <w:r>
-              <w:rPr>
-                <w:rFonts w:ascii="Calibri" w:hAnsi="Calibri" w:cs="Calibri"/>
-                <w:lang w:val="es-ES"/>
-              </w:rPr>
-              <w:t xml:space="preserve">MCP3304-BI/SL </w:t>
-            </w:r>
-            <w:proofErr w:type="spellStart"/>
-            <w:r>
-              <w:rPr>
-                <w:rFonts w:ascii="Calibri" w:hAnsi="Calibri" w:cs="Calibri"/>
-                <w:lang w:val="es-ES"/>
-              </w:rPr>
-              <w:t>Analogue</w:t>
-            </w:r>
-            <w:proofErr w:type="spellEnd"/>
-            <w:r>
-              <w:rPr>
-                <w:rFonts w:ascii="Calibri" w:hAnsi="Calibri" w:cs="Calibri"/>
-                <w:lang w:val="es-ES"/>
-              </w:rPr>
-              <w:t xml:space="preserve"> </w:t>
-            </w:r>
-            <w:proofErr w:type="spellStart"/>
-            <w:r>
-              <w:rPr>
-                <w:rFonts w:ascii="Calibri" w:hAnsi="Calibri" w:cs="Calibri"/>
-                <w:lang w:val="es-ES"/>
-              </w:rPr>
-              <w:t>to</w:t>
-            </w:r>
-            <w:proofErr w:type="spellEnd"/>
-            <w:r>
-              <w:rPr>
-                <w:rFonts w:ascii="Calibri" w:hAnsi="Calibri" w:cs="Calibri"/>
-                <w:lang w:val="es-ES"/>
-              </w:rPr>
-              <w:t xml:space="preserve"> Digital </w:t>
-            </w:r>
-            <w:proofErr w:type="spellStart"/>
-            <w:r>
-              <w:rPr>
-                <w:rFonts w:ascii="Calibri" w:hAnsi="Calibri" w:cs="Calibri"/>
-                <w:lang w:val="es-ES"/>
-              </w:rPr>
-              <w:t>Conver</w:t>
-            </w:r>
-            <w:r>
-              <w:rPr>
-                <w:rFonts w:ascii="Calibri" w:hAnsi="Calibri" w:cs="Calibri"/>
-                <w:lang w:val="es-ES"/>
-              </w:rPr>
-              <w:t>ter</w:t>
-            </w:r>
-            <w:proofErr w:type="spellEnd"/>
-            <w:r>
-              <w:rPr>
-                <w:rFonts w:ascii="Calibri" w:hAnsi="Calibri" w:cs="Calibri"/>
-                <w:lang w:val="es-ES"/>
-              </w:rPr>
-              <w:t xml:space="preserve"> </w:t>
-            </w:r>
-          </w:p>
-        </w:tc>
-        <w:tc>
-          <w:tcPr>
-            <w:tcW w:w="1134" w:type="dxa"/>
-          </w:tcPr>
-          <w:p>
-            <w:pPr>
-              <w:rPr>
-                <w:rFonts w:ascii="Calibri" w:hAnsi="Calibri" w:cs="Calibri"/>
-                <w:lang w:val="es-ES"/>
-              </w:rPr>
-            </w:pPr>
-            <w:r>
-              <w:rPr>
-                <w:rFonts w:ascii="Calibri" w:hAnsi="Calibri" w:cs="Calibri"/>
-                <w:lang w:val="es-ES"/>
+            <w:tcW w:w="1271" w:type="dxa"/>
+          </w:tcPr>
+          <w:p>
+            <w:pPr>
+              <w:rPr>
+                <w:rFonts w:ascii="Calibri" w:hAnsi="Calibri" w:cs="Calibri"/>
+              </w:rPr>
+            </w:pPr>
+            <w:r>
+              <w:rPr>
+                <w:rFonts w:ascii="Calibri" w:hAnsi="Calibri" w:cs="Calibri"/>
+              </w:rPr>
+              <w:t>3879695</w:t>
+            </w:r>
+          </w:p>
+        </w:tc>
+        <w:tc>
+          <w:tcPr>
+            <w:tcW w:w="4924" w:type="dxa"/>
+          </w:tcPr>
+          <w:p>
+            <w:pPr>
+              <w:rPr>
+                <w:rFonts w:ascii="Calibri" w:hAnsi="Calibri" w:cs="Calibri"/>
+              </w:rPr>
+            </w:pPr>
+            <w:r>
+              <w:rPr>
+                <w:rFonts w:ascii="Calibri" w:hAnsi="Calibri" w:cs="Calibri"/>
+              </w:rPr>
+              <w:t>FIT0291 IC Adapter Board</w:t>
+            </w:r>
+          </w:p>
+        </w:tc>
+        <w:tc>
+          <w:tcPr>
+            <w:tcW w:w="1075" w:type="dxa"/>
+          </w:tcPr>
+          <w:p>
+            <w:pPr>
+              <w:rPr>
+                <w:rFonts w:ascii="Calibri" w:hAnsi="Calibri" w:cs="Calibri"/>
+              </w:rPr>
+            </w:pPr>
+            <w:r>
+              <w:rPr>
+                <w:rFonts w:ascii="Calibri" w:hAnsi="Calibri" w:cs="Calibri"/>
               </w:rPr>
               <w:t>1</w:t>
             </w:r>
@@ -700,41 +992,37 @@
         </w:tc>
         <w:tc>
           <w:tcPr>
-            <w:tcW w:w="992" w:type="dxa"/>
-          </w:tcPr>
-          <w:p>
-            <w:pPr>
-              <w:rPr>
-                <w:rFonts w:ascii="Calibri" w:hAnsi="Calibri" w:cs="Calibri"/>
-                <w:lang w:val="es-ES"/>
-              </w:rPr>
-            </w:pPr>
-            <w:r>
-              <w:rPr>
-                <w:rFonts w:ascii="Calibri" w:hAnsi="Calibri" w:cs="Calibri"/>
-                <w:lang w:val="es-ES"/>
-              </w:rPr>
-              <w:t>5.11</w:t>
-            </w:r>
-          </w:p>
-        </w:tc>
-        <w:tc>
-          <w:tcPr>
-            <w:tcW w:w="1083" w:type="dxa"/>
-          </w:tcPr>
-          <w:p>
-            <w:pPr>
-              <w:rPr>
-                <w:rFonts w:ascii="Calibri" w:hAnsi="Calibri" w:cs="Calibri"/>
-                <w:lang w:val="es-ES"/>
-              </w:rPr>
-            </w:pPr>
-            <w:r>
-              <w:rPr>
-                <w:rFonts w:ascii="Calibri" w:hAnsi="Calibri" w:cs="Calibri"/>
-                <w:lang w:val="es-ES"/>
-              </w:rPr>
-              <w:t>5.11</w:t>
+            <w:tcW w:w="788" w:type="dxa"/>
+          </w:tcPr>
+          <w:p>
+            <w:pPr>
+              <w:rPr>
+                <w:rFonts w:ascii="Calibri" w:hAnsi="Calibri" w:cs="Calibri"/>
+              </w:rPr>
+            </w:pPr>
+            <w:r>
+              <w:rPr>
+                <w:rFonts w:ascii="Calibri" w:hAnsi="Calibri" w:cs="Calibri"/>
+              </w:rPr>
+              <w:t>0.70</w:t>
+            </w:r>
+          </w:p>
+        </w:tc>
+        <w:tc>
+          <w:tcPr>
+            <w:tcW w:w="1435" w:type="dxa"/>
+          </w:tcPr>
+          <w:p>
+            <w:pPr>
+              <w:rPr>
+                <w:rFonts w:ascii="Calibri" w:hAnsi="Calibri" w:cs="Calibri"/>
+              </w:rPr>
+            </w:pPr>
+            <w:r>
+              <w:rPr>
+                <w:rFonts w:ascii="Calibri" w:hAnsi="Calibri" w:cs="Calibri"/>
+              </w:rPr>
+              <w:t>0.70</w:t>
             </w:r>
           </w:p>
         </w:tc>
@@ -742,97 +1030,91 @@
       <w:tr>
         <w:tc>
           <w:tcPr>
-            <w:tcW w:w="5807" w:type="dxa"/>
-          </w:tcPr>
-          <w:p>
-            <w:pPr>
-              <w:rPr>
-                <w:rFonts w:ascii="Calibri" w:hAnsi="Calibri" w:cs="Calibri"/>
-                <w:lang w:val="es-ES"/>
-              </w:rPr>
-            </w:pPr>
-            <w:r>
-              <w:rPr>
-                <w:rFonts w:ascii="Calibri" w:hAnsi="Calibri" w:cs="Calibri"/>
-                <w:lang w:val="es-ES"/>
-              </w:rPr>
-              <w:t xml:space="preserve">FIT0291 IC </w:t>
-            </w:r>
-            <w:proofErr w:type="spellStart"/>
-            <w:r>
-              <w:rPr>
-                <w:rFonts w:ascii="Calibri" w:hAnsi="Calibri" w:cs="Calibri"/>
-                <w:lang w:val="es-ES"/>
-              </w:rPr>
-              <w:t>Adapter</w:t>
-            </w:r>
-            <w:proofErr w:type="spellEnd"/>
-            <w:r>
-              <w:rPr>
-                <w:rFonts w:ascii="Calibri" w:hAnsi="Calibri" w:cs="Calibri"/>
-                <w:lang w:val="es-ES"/>
-              </w:rPr>
-              <w:t xml:space="preserve"> Board</w:t>
-            </w:r>
-          </w:p>
-        </w:tc>
-        <w:tc>
-          <w:tcPr>
-            <w:tcW w:w="1134" w:type="dxa"/>
-          </w:tcPr>
-          <w:p>
-            <w:pPr>
-              <w:rPr>
-                <w:rFonts w:ascii="Calibri" w:hAnsi="Calibri" w:cs="Calibri"/>
-                <w:lang w:val="es-ES"/>
-              </w:rPr>
-            </w:pPr>
-            <w:r>
-              <w:rPr>
-                <w:rFonts w:ascii="Calibri" w:hAnsi="Calibri" w:cs="Calibri"/>
-                <w:lang w:val="es-ES"/>
-              </w:rPr>
-              <w:t>1</w:t>
-            </w:r>
-          </w:p>
-        </w:tc>
-        <w:tc>
-          <w:tcPr>
-            <w:tcW w:w="992" w:type="dxa"/>
-          </w:tcPr>
-          <w:p>
-            <w:pPr>
-              <w:rPr>
-                <w:rFonts w:ascii="Calibri" w:hAnsi="Calibri" w:cs="Calibri"/>
-                <w:lang w:val="es-ES"/>
-              </w:rPr>
-            </w:pPr>
-            <w:r>
-              <w:rPr>
-                <w:rFonts w:ascii="Calibri" w:hAnsi="Calibri" w:cs="Calibri"/>
-                <w:lang w:val="es-ES"/>
-              </w:rPr>
-              <w:t>0.84</w:t>
-            </w:r>
-          </w:p>
-        </w:tc>
-        <w:tc>
-          <w:tcPr>
-            <w:tcW w:w="1083" w:type="dxa"/>
-          </w:tcPr>
-          <w:p>
-            <w:pPr>
-              <w:rPr>
-                <w:rFonts w:ascii="Calibri" w:hAnsi="Calibri" w:cs="Calibri"/>
-                <w:lang w:val="es-ES"/>
-              </w:rPr>
-            </w:pPr>
-            <w:r>
-              <w:rPr>
-                <w:rFonts w:ascii="Calibri" w:hAnsi="Calibri" w:cs="Calibri"/>
-                <w:lang w:val="es-ES"/>
-              </w:rPr>
-              <w:t>0.84</w:t>
+            <w:tcW w:w="1271" w:type="dxa"/>
+          </w:tcPr>
+          <w:p>
+            <w:pPr>
+              <w:rPr>
+                <w:rFonts w:ascii="Calibri" w:hAnsi="Calibri" w:cs="Calibri"/>
+              </w:rPr>
+            </w:pPr>
+            <w:r>
+              <w:rPr>
+                <w:rFonts w:ascii="Calibri" w:hAnsi="Calibri" w:cs="Calibri"/>
+              </w:rPr>
+              <w:t>4568806</w:t>
+            </w:r>
+          </w:p>
+        </w:tc>
+        <w:tc>
+          <w:tcPr>
+            <w:tcW w:w="4924" w:type="dxa"/>
+          </w:tcPr>
+          <w:p>
+            <w:pPr>
+              <w:rPr>
+                <w:rFonts w:ascii="Calibri" w:hAnsi="Calibri" w:cs="Calibri"/>
+              </w:rPr>
+            </w:pPr>
+            <w:r>
+              <w:rPr>
+                <w:rFonts w:ascii="Calibri" w:hAnsi="Calibri" w:cs="Calibri"/>
+              </w:rPr>
+              <w:t>CTM-30C Crocodile Clip</w:t>
+            </w:r>
+          </w:p>
+        </w:tc>
+        <w:tc>
+          <w:tcPr>
+            <w:tcW w:w="1075" w:type="dxa"/>
+          </w:tcPr>
+          <w:p>
+            <w:pPr>
+              <w:rPr>
+                <w:rFonts w:ascii="Calibri" w:hAnsi="Calibri" w:cs="Calibri"/>
+              </w:rPr>
+            </w:pPr>
+            <w:r>
+              <w:rPr>
+                <w:rFonts w:ascii="Calibri" w:hAnsi="Calibri" w:cs="Calibri"/>
+              </w:rPr>
+              <w:t>4</w:t>
+            </w:r>
+          </w:p>
+        </w:tc>
+        <w:tc>
+          <w:tcPr>
+            <w:tcW w:w="788" w:type="dxa"/>
+          </w:tcPr>
+          <w:p>
+            <w:pPr>
+              <w:rPr>
+                <w:rFonts w:ascii="Calibri" w:hAnsi="Calibri" w:cs="Calibri"/>
+              </w:rPr>
+            </w:pPr>
+            <w:r>
+              <w:rPr>
+                <w:rFonts w:ascii="Calibri" w:hAnsi="Calibri" w:cs="Calibri"/>
+              </w:rPr>
+              <w:t>0.35</w:t>
+            </w:r>
+          </w:p>
+        </w:tc>
+        <w:tc>
+          <w:tcPr>
+            <w:tcW w:w="1435" w:type="dxa"/>
+          </w:tcPr>
+          <w:p>
+            <w:pPr>
+              <w:rPr>
+                <w:rFonts w:ascii="Calibri" w:hAnsi="Calibri" w:cs="Calibri"/>
+              </w:rPr>
+            </w:pPr>
+            <w:r>
+              <w:rPr>
+                <w:rFonts w:ascii="Calibri" w:hAnsi="Calibri" w:cs="Calibri"/>
+              </w:rPr>
+              <w:t>1.40</w:t>
             </w:r>
           </w:p>
         </w:tc>
@@ -840,97 +1122,97 @@
       <w:tr>
         <w:tc>
           <w:tcPr>
-            <w:tcW w:w="5807" w:type="dxa"/>
-          </w:tcPr>
-          <w:p>
-            <w:pPr>
-              <w:rPr>
-                <w:rFonts w:ascii="Calibri" w:hAnsi="Calibri" w:cs="Calibri"/>
-                <w:lang w:val="es-ES"/>
-              </w:rPr>
-            </w:pPr>
-            <w:r>
-              <w:rPr>
-                <w:rFonts w:ascii="Calibri" w:hAnsi="Calibri" w:cs="Calibri"/>
-                <w:lang w:val="es-ES"/>
-              </w:rPr>
-              <w:t xml:space="preserve">CTM-30C </w:t>
-            </w:r>
-            <w:proofErr w:type="spellStart"/>
-            <w:r>
-              <w:rPr>
-                <w:rFonts w:ascii="Calibri" w:hAnsi="Calibri" w:cs="Calibri"/>
-                <w:lang w:val="es-ES"/>
-              </w:rPr>
-              <w:t>Crocodile</w:t>
-            </w:r>
-            <w:proofErr w:type="spellEnd"/>
-            <w:r>
-              <w:rPr>
-                <w:rFonts w:ascii="Calibri" w:hAnsi="Calibri" w:cs="Calibri"/>
-                <w:lang w:val="es-ES"/>
-              </w:rPr>
-              <w:t xml:space="preserve"> Clip</w:t>
-            </w:r>
-          </w:p>
-        </w:tc>
-        <w:tc>
-          <w:tcPr>
-            <w:tcW w:w="1134" w:type="dxa"/>
-          </w:tcPr>
-          <w:p>
-            <w:pPr>
-              <w:rPr>
-                <w:rFonts w:ascii="Calibri" w:hAnsi="Calibri" w:cs="Calibri"/>
-                <w:lang w:val="es-ES"/>
-              </w:rPr>
-            </w:pPr>
-            <w:r>
-              <w:rPr>
-                <w:rFonts w:ascii="Calibri" w:hAnsi="Calibri" w:cs="Calibri"/>
-                <w:lang w:val="es-ES"/>
-              </w:rPr>
-              <w:t>4</w:t>
-            </w:r>
-          </w:p>
-        </w:tc>
-        <w:tc>
-          <w:tcPr>
-            <w:tcW w:w="992" w:type="dxa"/>
-          </w:tcPr>
-          <w:p>
-            <w:pPr>
-              <w:rPr>
-                <w:rFonts w:ascii="Calibri" w:hAnsi="Calibri" w:cs="Calibri"/>
-                <w:lang w:val="es-ES"/>
-              </w:rPr>
-            </w:pPr>
-            <w:r>
-              <w:rPr>
-                <w:rFonts w:ascii="Calibri" w:hAnsi="Calibri" w:cs="Calibri"/>
-                <w:lang w:val="es-ES"/>
-              </w:rPr>
-              <w:t>0.42</w:t>
-            </w:r>
-          </w:p>
-        </w:tc>
-        <w:tc>
-          <w:tcPr>
-            <w:tcW w:w="1083" w:type="dxa"/>
-          </w:tcPr>
-          <w:p>
-            <w:pPr>
-              <w:rPr>
-                <w:rFonts w:ascii="Calibri" w:hAnsi="Calibri" w:cs="Calibri"/>
-                <w:lang w:val="es-ES"/>
-              </w:rPr>
-            </w:pPr>
-            <w:r>
-              <w:rPr>
-                <w:rFonts w:ascii="Calibri" w:hAnsi="Calibri" w:cs="Calibri"/>
-                <w:lang w:val="es-ES"/>
-              </w:rPr>
-              <w:t>1.68</w:t>
+            <w:tcW w:w="1271" w:type="dxa"/>
+          </w:tcPr>
+          <w:p>
+            <w:pPr>
+              <w:tabs>
+                <w:tab w:val="left" w:pos="3390"/>
+              </w:tabs>
+              <w:rPr>
+                <w:rFonts w:ascii="Calibri" w:hAnsi="Calibri" w:cs="Calibri"/>
+              </w:rPr>
+            </w:pPr>
+            <w:r>
+              <w:rPr>
+                <w:rFonts w:ascii="Calibri" w:hAnsi="Calibri" w:cs="Calibri"/>
+              </w:rPr>
+              <w:t>45555436</w:t>
+            </w:r>
+          </w:p>
+        </w:tc>
+        <w:tc>
+          <w:tcPr>
+            <w:tcW w:w="4924" w:type="dxa"/>
+          </w:tcPr>
+          <w:p>
+            <w:pPr>
+              <w:tabs>
+                <w:tab w:val="left" w:pos="3390"/>
+              </w:tabs>
+              <w:rPr>
+                <w:rFonts w:ascii="Calibri" w:hAnsi="Calibri" w:cs="Calibri"/>
+              </w:rPr>
+            </w:pPr>
+            <w:r>
+              <w:rPr>
+                <w:rFonts w:ascii="Calibri" w:hAnsi="Calibri" w:cs="Calibri"/>
+              </w:rPr>
+              <w:t>1N4148 Diode</w:t>
+            </w:r>
+          </w:p>
+        </w:tc>
+        <w:tc>
+          <w:tcPr>
+            <w:tcW w:w="1075" w:type="dxa"/>
+          </w:tcPr>
+          <w:p>
+            <w:pPr>
+              <w:rPr>
+                <w:rFonts w:ascii="Calibri" w:hAnsi="Calibri" w:cs="Calibri"/>
+              </w:rPr>
+            </w:pPr>
+            <w:r>
+              <w:rPr>
+                <w:rFonts w:ascii="Calibri" w:hAnsi="Calibri" w:cs="Calibri"/>
+              </w:rPr>
+              <w:t>10</w:t>
+            </w:r>
+          </w:p>
+        </w:tc>
+        <w:tc>
+          <w:tcPr>
+            <w:tcW w:w="788" w:type="dxa"/>
+          </w:tcPr>
+          <w:p>
+            <w:pPr>
+              <w:rPr>
+                <w:rFonts w:ascii="Calibri" w:hAnsi="Calibri" w:cs="Calibri"/>
+              </w:rPr>
+            </w:pPr>
+            <w:r>
+              <w:rPr>
+                <w:rFonts w:ascii="Calibri" w:hAnsi="Calibri" w:cs="Calibri"/>
+              </w:rPr>
+              <w:t>0.04</w:t>
+            </w:r>
+          </w:p>
+        </w:tc>
+        <w:tc>
+          <w:tcPr>
+            <w:tcW w:w="1435" w:type="dxa"/>
+          </w:tcPr>
+          <w:p>
+            <w:pPr>
+              <w:rPr>
+                <w:rFonts w:ascii="Calibri" w:hAnsi="Calibri" w:cs="Calibri"/>
+              </w:rPr>
+            </w:pPr>
+            <w:r>
+              <w:rPr>
+                <w:rFonts w:ascii="Calibri" w:hAnsi="Calibri" w:cs="Calibri"/>
+              </w:rPr>
+              <w:t>0.44</w:t>
             </w:r>
           </w:p>
         </w:tc>
@@ -938,64 +1220,367 @@
       <w:tr>
         <w:tc>
           <w:tcPr>
-            <w:tcW w:w="5807" w:type="dxa"/>
-          </w:tcPr>
-          <w:p>
-            <w:pPr>
-              <w:rPr>
-                <w:rFonts w:ascii="Calibri" w:hAnsi="Calibri" w:cs="Calibri"/>
-                <w:lang w:val="es-ES"/>
-              </w:rPr>
-            </w:pPr>
-          </w:p>
-        </w:tc>
-        <w:tc>
-          <w:tcPr>
-            <w:tcW w:w="1134" w:type="dxa"/>
-          </w:tcPr>
-          <w:p>
-            <w:pPr>
-              <w:rPr>
-                <w:rFonts w:ascii="Calibri" w:hAnsi="Calibri" w:cs="Calibri"/>
-                <w:lang w:val="es-ES"/>
-              </w:rPr>
-            </w:pPr>
-          </w:p>
-        </w:tc>
-        <w:tc>
-          <w:tcPr>
-            <w:tcW w:w="992" w:type="dxa"/>
-          </w:tcPr>
-          <w:p>
-            <w:pPr>
-              <w:rPr>
-                <w:rFonts w:ascii="Calibri" w:hAnsi="Calibri" w:cs="Calibri"/>
-                <w:lang w:val="es-ES"/>
-              </w:rPr>
-            </w:pPr>
-          </w:p>
-        </w:tc>
-        <w:tc>
-          <w:tcPr>
-            <w:tcW w:w="1083" w:type="dxa"/>
-          </w:tcPr>
-          <w:p>
-            <w:pPr>
-              <w:rPr>
-                <w:rFonts w:ascii="Calibri" w:hAnsi="Calibri" w:cs="Calibri"/>
-              </w:rPr>
-            </w:pPr>
-            <w:r>
-              <w:rPr>
-                <w:rFonts w:ascii="Calibri" w:hAnsi="Calibri" w:cs="Calibri"/>
-              </w:rPr>
-              <w:t>Overall Cost:</w:t>
-            </w:r>
-            <w:r>
-              <w:rPr>
-                <w:rFonts w:ascii="Calibri" w:hAnsi="Calibri" w:cs="Calibri"/>
-              </w:rPr>
-              <w:t xml:space="preserve"> 11.47</w:t>
+            <w:tcW w:w="1271" w:type="dxa"/>
+          </w:tcPr>
+          <w:p>
+            <w:pPr>
+              <w:tabs>
+                <w:tab w:val="left" w:pos="3390"/>
+              </w:tabs>
+              <w:rPr>
+                <w:rFonts w:ascii="Calibri" w:hAnsi="Calibri" w:cs="Calibri"/>
+              </w:rPr>
+            </w:pPr>
+            <w:r>
+              <w:rPr>
+                <w:rFonts w:ascii="Calibri" w:hAnsi="Calibri" w:cs="Calibri"/>
+              </w:rPr>
+              <w:t>3118236</w:t>
+            </w:r>
+          </w:p>
+        </w:tc>
+        <w:tc>
+          <w:tcPr>
+            <w:tcW w:w="4924" w:type="dxa"/>
+          </w:tcPr>
+          <w:p>
+            <w:pPr>
+              <w:tabs>
+                <w:tab w:val="left" w:pos="3390"/>
+              </w:tabs>
+              <w:rPr>
+                <w:rFonts w:ascii="Calibri" w:hAnsi="Calibri" w:cs="Calibri"/>
+              </w:rPr>
+            </w:pPr>
+            <w:r>
+              <w:rPr>
+                <w:rFonts w:ascii="Calibri" w:hAnsi="Calibri" w:cs="Calibri"/>
+              </w:rPr>
+              <w:t>CD4066BE Analogue Switch</w:t>
+            </w:r>
+          </w:p>
+        </w:tc>
+        <w:tc>
+          <w:tcPr>
+            <w:tcW w:w="1075" w:type="dxa"/>
+          </w:tcPr>
+          <w:p>
+            <w:pPr>
+              <w:rPr>
+                <w:rFonts w:ascii="Calibri" w:hAnsi="Calibri" w:cs="Calibri"/>
+              </w:rPr>
+            </w:pPr>
+            <w:r>
+              <w:rPr>
+                <w:rFonts w:ascii="Calibri" w:hAnsi="Calibri" w:cs="Calibri"/>
+              </w:rPr>
+              <w:t>1</w:t>
+            </w:r>
+          </w:p>
+        </w:tc>
+        <w:tc>
+          <w:tcPr>
+            <w:tcW w:w="788" w:type="dxa"/>
+          </w:tcPr>
+          <w:p>
+            <w:pPr>
+              <w:rPr>
+                <w:rFonts w:ascii="Calibri" w:hAnsi="Calibri" w:cs="Calibri"/>
+              </w:rPr>
+            </w:pPr>
+            <w:r>
+              <w:rPr>
+                <w:rFonts w:ascii="Calibri" w:hAnsi="Calibri" w:cs="Calibri"/>
+              </w:rPr>
+              <w:t>0.72</w:t>
+            </w:r>
+          </w:p>
+        </w:tc>
+        <w:tc>
+          <w:tcPr>
+            <w:tcW w:w="1435" w:type="dxa"/>
+          </w:tcPr>
+          <w:p>
+            <w:pPr>
+              <w:rPr>
+                <w:rFonts w:ascii="Calibri" w:hAnsi="Calibri" w:cs="Calibri"/>
+              </w:rPr>
+            </w:pPr>
+            <w:r>
+              <w:rPr>
+                <w:rFonts w:ascii="Calibri" w:hAnsi="Calibri" w:cs="Calibri"/>
+              </w:rPr>
+              <w:t>0.72</w:t>
+            </w:r>
+          </w:p>
+        </w:tc>
+      </w:tr>
+      <w:tr>
+        <w:tc>
+          <w:tcPr>
+            <w:tcW w:w="1271" w:type="dxa"/>
+          </w:tcPr>
+          <w:p>
+            <w:pPr>
+              <w:tabs>
+                <w:tab w:val="left" w:pos="3390"/>
+              </w:tabs>
+              <w:rPr>
+                <w:rFonts w:ascii="Calibri" w:hAnsi="Calibri" w:cs="Calibri"/>
+              </w:rPr>
+            </w:pPr>
+            <w:r>
+              <w:rPr>
+                <w:rFonts w:ascii="Calibri" w:hAnsi="Calibri" w:cs="Calibri"/>
+              </w:rPr>
+              <w:t>4733577</w:t>
+            </w:r>
+          </w:p>
+        </w:tc>
+        <w:tc>
+          <w:tcPr>
+            <w:tcW w:w="4924" w:type="dxa"/>
+          </w:tcPr>
+          <w:p>
+            <w:pPr>
+              <w:tabs>
+                <w:tab w:val="left" w:pos="3390"/>
+              </w:tabs>
+              <w:rPr>
+                <w:rFonts w:ascii="Calibri" w:hAnsi="Calibri" w:cs="Calibri"/>
+              </w:rPr>
+            </w:pPr>
+            <w:r>
+              <w:rPr>
+                <w:rFonts w:ascii="Calibri" w:hAnsi="Calibri" w:cs="Calibri"/>
+              </w:rPr>
+              <w:t>HFD4/5 DPDT Relay</w:t>
+            </w:r>
+          </w:p>
+        </w:tc>
+        <w:tc>
+          <w:tcPr>
+            <w:tcW w:w="1075" w:type="dxa"/>
+          </w:tcPr>
+          <w:p>
+            <w:pPr>
+              <w:rPr>
+                <w:rFonts w:ascii="Calibri" w:hAnsi="Calibri" w:cs="Calibri"/>
+              </w:rPr>
+            </w:pPr>
+            <w:r>
+              <w:rPr>
+                <w:rFonts w:ascii="Calibri" w:hAnsi="Calibri" w:cs="Calibri"/>
+              </w:rPr>
+              <w:t>2</w:t>
+            </w:r>
+          </w:p>
+        </w:tc>
+        <w:tc>
+          <w:tcPr>
+            <w:tcW w:w="788" w:type="dxa"/>
+          </w:tcPr>
+          <w:p>
+            <w:pPr>
+              <w:rPr>
+                <w:rFonts w:ascii="Calibri" w:hAnsi="Calibri" w:cs="Calibri"/>
+              </w:rPr>
+            </w:pPr>
+            <w:r>
+              <w:rPr>
+                <w:rFonts w:ascii="Calibri" w:hAnsi="Calibri" w:cs="Calibri"/>
+              </w:rPr>
+              <w:t>1.63</w:t>
+            </w:r>
+          </w:p>
+        </w:tc>
+        <w:tc>
+          <w:tcPr>
+            <w:tcW w:w="1435" w:type="dxa"/>
+          </w:tcPr>
+          <w:p>
+            <w:pPr>
+              <w:rPr>
+                <w:rFonts w:ascii="Calibri" w:hAnsi="Calibri" w:cs="Calibri"/>
+              </w:rPr>
+            </w:pPr>
+            <w:r>
+              <w:rPr>
+                <w:rFonts w:ascii="Calibri" w:hAnsi="Calibri" w:cs="Calibri"/>
+              </w:rPr>
+              <w:t>3.26</w:t>
+            </w:r>
+          </w:p>
+        </w:tc>
+      </w:tr>
+      <w:tr>
+        <w:tc>
+          <w:tcPr>
+            <w:tcW w:w="1271" w:type="dxa"/>
+          </w:tcPr>
+          <w:p>
+            <w:pPr>
+              <w:tabs>
+                <w:tab w:val="left" w:pos="3390"/>
+              </w:tabs>
+              <w:rPr>
+                <w:rFonts w:ascii="Calibri" w:hAnsi="Calibri" w:cs="Calibri"/>
+              </w:rPr>
+            </w:pPr>
+            <w:r>
+              <w:rPr>
+                <w:rFonts w:ascii="Calibri" w:hAnsi="Calibri" w:cs="Calibri"/>
+              </w:rPr>
+              <w:t>4710279</w:t>
+            </w:r>
+          </w:p>
+        </w:tc>
+        <w:tc>
+          <w:tcPr>
+            <w:tcW w:w="4924" w:type="dxa"/>
+          </w:tcPr>
+          <w:p>
+            <w:pPr>
+              <w:tabs>
+                <w:tab w:val="left" w:pos="3390"/>
+              </w:tabs>
+              <w:rPr>
+                <w:rFonts w:ascii="Calibri" w:hAnsi="Calibri" w:cs="Calibri"/>
+              </w:rPr>
+            </w:pPr>
+            <w:r>
+              <w:rPr>
+                <w:rFonts w:ascii="Calibri" w:hAnsi="Calibri" w:cs="Calibri"/>
+              </w:rPr>
+              <w:t>BC549 BBK NPN BJT</w:t>
+            </w:r>
+          </w:p>
+        </w:tc>
+        <w:tc>
+          <w:tcPr>
+            <w:tcW w:w="1075" w:type="dxa"/>
+          </w:tcPr>
+          <w:p>
+            <w:pPr>
+              <w:rPr>
+                <w:rFonts w:ascii="Calibri" w:hAnsi="Calibri" w:cs="Calibri"/>
+              </w:rPr>
+            </w:pPr>
+            <w:r>
+              <w:rPr>
+                <w:rFonts w:ascii="Calibri" w:hAnsi="Calibri" w:cs="Calibri"/>
+              </w:rPr>
+              <w:t>2</w:t>
+            </w:r>
+          </w:p>
+        </w:tc>
+        <w:tc>
+          <w:tcPr>
+            <w:tcW w:w="788" w:type="dxa"/>
+          </w:tcPr>
+          <w:p>
+            <w:pPr>
+              <w:rPr>
+                <w:rFonts w:ascii="Calibri" w:hAnsi="Calibri" w:cs="Calibri"/>
+              </w:rPr>
+            </w:pPr>
+            <w:r>
+              <w:rPr>
+                <w:rFonts w:ascii="Calibri" w:hAnsi="Calibri" w:cs="Calibri"/>
+              </w:rPr>
+              <w:t>0.02</w:t>
+            </w:r>
+          </w:p>
+        </w:tc>
+        <w:tc>
+          <w:tcPr>
+            <w:tcW w:w="1435" w:type="dxa"/>
+          </w:tcPr>
+          <w:p>
+            <w:pPr>
+              <w:rPr>
+                <w:rFonts w:ascii="Calibri" w:hAnsi="Calibri" w:cs="Calibri"/>
+              </w:rPr>
+            </w:pPr>
+            <w:r>
+              <w:rPr>
+                <w:rFonts w:ascii="Calibri" w:hAnsi="Calibri" w:cs="Calibri"/>
+              </w:rPr>
+              <w:t>0.02</w:t>
+            </w:r>
+          </w:p>
+        </w:tc>
+      </w:tr>
+      <w:tr>
+        <w:tc>
+          <w:tcPr>
+            <w:tcW w:w="1271" w:type="dxa"/>
+          </w:tcPr>
+          <w:p>
+            <w:pPr>
+              <w:rPr>
+                <w:rFonts w:ascii="Calibri" w:hAnsi="Calibri" w:cs="Calibri"/>
+              </w:rPr>
+            </w:pPr>
+          </w:p>
+        </w:tc>
+        <w:tc>
+          <w:tcPr>
+            <w:tcW w:w="4924" w:type="dxa"/>
+          </w:tcPr>
+          <w:p>
+            <w:pPr>
+              <w:rPr>
+                <w:rFonts w:ascii="Calibri" w:hAnsi="Calibri" w:cs="Calibri"/>
+              </w:rPr>
+            </w:pPr>
+          </w:p>
+        </w:tc>
+        <w:tc>
+          <w:tcPr>
+            <w:tcW w:w="1075" w:type="dxa"/>
+          </w:tcPr>
+          <w:p>
+            <w:pPr>
+              <w:rPr>
+                <w:rFonts w:ascii="Calibri" w:hAnsi="Calibri" w:cs="Calibri"/>
+              </w:rPr>
+            </w:pPr>
+          </w:p>
+        </w:tc>
+        <w:tc>
+          <w:tcPr>
+            <w:tcW w:w="788" w:type="dxa"/>
+          </w:tcPr>
+          <w:p>
+            <w:pPr>
+              <w:rPr>
+                <w:rFonts w:ascii="Calibri" w:hAnsi="Calibri" w:cs="Calibri"/>
+              </w:rPr>
+            </w:pPr>
+          </w:p>
+        </w:tc>
+        <w:tc>
+          <w:tcPr>
+            <w:tcW w:w="1435" w:type="dxa"/>
+          </w:tcPr>
+          <w:p>
+            <w:pPr>
+              <w:rPr>
+                <w:rFonts w:ascii="Calibri" w:hAnsi="Calibri" w:cs="Calibri"/>
+              </w:rPr>
+            </w:pPr>
+            <w:r>
+              <w:rPr>
+                <w:rFonts w:ascii="Calibri" w:hAnsi="Calibri" w:cs="Calibri"/>
+              </w:rPr>
+              <w:t xml:space="preserve">Overall Cost: </w:t>
+            </w:r>
+            <w:r>
+              <w:rPr>
+                <w:rFonts w:ascii="Calibri" w:hAnsi="Calibri" w:cs="Calibri"/>
+              </w:rPr>
+              <w:t>12.16</w:t>
             </w:r>
           </w:p>
         </w:tc>
@@ -1033,16 +1618,97 @@
       <w:pPr>
         <w:rPr>
           <w:rFonts w:ascii="Calibri" w:hAnsi="Calibri" w:cs="Calibri"/>
-          <w:u w:val="single"/>
-        </w:rPr>
-      </w:pPr>
+        </w:rPr>
+      </w:pPr>
+      <w:r>
+        <w:rPr>
+          <w:rFonts w:ascii="Calibri" w:hAnsi="Calibri" w:cs="Calibri"/>
+        </w:rPr>
+        <w:t>Rahul:</w:t>
+      </w:r>
     </w:p>
     <w:p>
       <w:pPr>
         <w:rPr>
           <w:rFonts w:ascii="Calibri" w:hAnsi="Calibri" w:cs="Calibri"/>
+        </w:rPr>
+      </w:pPr>
+      <w:r>
+        <w:rPr>
+          <w:rFonts w:ascii="Calibri" w:hAnsi="Calibri" w:cs="Calibri"/>
+        </w:rPr>
+        <w:t xml:space="preserve">Largely in charge of Analogue circuit and Firmware on the Arduino </w:t>
+      </w:r>
+    </w:p>
+    <w:p>
+      <w:pPr>
+        <w:rPr>
+          <w:rFonts w:ascii="Calibri" w:hAnsi="Calibri" w:cs="Calibri"/>
+        </w:rPr>
+      </w:pPr>
+      <w:r>
+        <w:rPr>
+          <w:rFonts w:ascii="Calibri" w:hAnsi="Calibri" w:cs="Calibri"/>
+        </w:rPr>
+        <w:t>Owen:</w:t>
+      </w:r>
+    </w:p>
+    <w:p>
+      <w:pPr>
+        <w:rPr>
+          <w:rFonts w:ascii="Calibri" w:hAnsi="Calibri" w:cs="Calibri"/>
+        </w:rPr>
+      </w:pPr>
+      <w:r>
+        <w:rPr>
+          <w:rFonts w:ascii="Calibri" w:hAnsi="Calibri" w:cs="Calibri"/>
+        </w:rPr>
+        <w:t>In charge of PC receiver and Data visualisation and User Interface.</w:t>
+      </w:r>
+    </w:p>
+    <w:p>
+      <w:pPr>
+        <w:ind w:left="720" w:hanging="720"/>
+        <w:rPr>
+          <w:rFonts w:ascii="Calibri" w:hAnsi="Calibri" w:cs="Calibri"/>
           <w:u w:val="single"/>
-          <w:lang w:val="de-DE"/>
+        </w:rPr>
+      </w:pPr>
+      <w:r>
+        <w:rPr>
+          <w:rFonts w:ascii="Calibri" w:hAnsi="Calibri" w:cs="Calibri"/>
+          <w:u w:val="single"/>
+        </w:rPr>
+        <w:t>Testing</w:t>
+      </w:r>
+    </w:p>
+    <w:p>
+      <w:pPr>
+        <w:ind w:left="720" w:hanging="720"/>
+        <w:rPr>
+          <w:rFonts w:ascii="Calibri" w:hAnsi="Calibri" w:cs="Calibri"/>
+        </w:rPr>
+      </w:pPr>
+      <w:r>
+        <w:rPr>
+          <w:rFonts w:ascii="Calibri" w:hAnsi="Calibri" w:cs="Calibri"/>
+        </w:rPr>
+        <w:t>Ideally use a function generator, if unavailable use an oscillating pin on the Arduino and various combinations of R and C to filter given frequencies so that measurements may be taken by the oscilloscope to verify its behaviour. It this option is chosen another oscilloscope would be ideal to verify behaviour.</w:t>
+      </w:r>
+    </w:p>
+    <w:p>
+      <w:pPr>
+        <w:rPr>
+          <w:rFonts w:ascii="Calibri" w:hAnsi="Calibri" w:cs="Calibri"/>
+          <w:u w:val="single"/>
+        </w:rPr>
+      </w:pPr>
+    </w:p>
+    <w:p>
+      <w:pPr>
+        <w:rPr>
+          <w:rFonts w:ascii="Calibri" w:hAnsi="Calibri" w:cs="Calibri"/>
+          <w:u w:val="single"/>
         </w:rPr>
       </w:pPr>
     </w:p>
@@ -1054,6 +1720,127 @@
     </w:sectPr>
   </w:body>
 </w:document>
+</file>
+
+<file path=word/numbering.xml><?xml version="1.0" encoding="utf-8"?>
+<w:numbering xmlns:wpc="http://schemas.microsoft.com/office/word/2010/wordprocessingCanvas" xmlns:cx="http://schemas.microsoft.com/office/drawing/2014/chartex" xmlns:cx1="http://schemas.microsoft.com/office/drawing/2015/9/8/chartex" xmlns:cx2="http://schemas.microsoft.com/office/drawing/2015/10/21/chartex" xmlns:cx3="http://schemas.microsoft.com/office/drawing/2016/5/9/chartex" xmlns:cx4="http://schemas.microsoft.com/office/drawing/2016/5/10/chartex" xmlns:cx5="http://schemas.microsoft.com/office/drawing/2016/5/11/chartex" xmlns:cx6="http://schemas.microsoft.com/office/drawing/2016/5/12/chartex" xmlns:cx7="http://schemas.microsoft.com/office/drawing/2016/5/13/chartex" xmlns:cx8="http://schemas.microsoft.com/office/drawing/2016/5/14/chartex" xmlns:mc="http://schemas.openxmlformats.org/markup-compatibility/2006" xmlns:aink="http://schemas.microsoft.com/office/drawing/2016/ink" xmlns:am3d="http://schemas.microsoft.com/office/drawing/2017/model3d" xmlns:o="urn:schemas-microsoft-com:office:office" xmlns:oel="http://schemas.microsoft.com/office/2019/extlst" xmlns:r="http://schemas.openxmlformats.org/officeDocument/2006/relationships" xmlns:m="http://schemas.openxmlformats.org/officeDocument/2006/math" xmlns:v="urn:schemas-microsoft-com:vml" xmlns:wp14="http://schemas.microsoft.com/office/word/2010/wordprocessingDrawing" xmlns:wp="http://schemas.openxmlformats.org/drawingml/2006/wordprocessingDrawing" xmlns:w10="urn:schemas-microsoft-com:office:word" xmlns:w="http://schemas.openxmlformats.org/wordprocessingml/2006/main" xmlns:w14="http://schemas.microsoft.com/office/word/2010/wordml" xmlns:w15="http://schemas.microsoft.com/office/word/2012/wordml" xmlns:w16cex="http://schemas.microsoft.com/office/word/2018/wordml/cex" xmlns:w16cid="http://schemas.microsoft.com/office/word/2016/wordml/cid" xmlns:w16="http://schemas.microsoft.com/office/word/2018/wordml" xmlns:w16du="http://schemas.microsoft.com/office/word/2023/wordml/word16du" xmlns:w16sdtdh="http://schemas.microsoft.com/office/word/2020/wordml/sdtdatahash" xmlns:w16sdtfl="http://schemas.microsoft.com/office/word/2024/wordml/sdtformatlock" xmlns:w16se="http://schemas.microsoft.com/office/word/2015/wordml/symex" xmlns:wpg="http://schemas.microsoft.com/office/word/2010/wordprocessingGroup" xmlns:wpi="http://schemas.microsoft.com/office/word/2010/wordprocessingInk" xmlns:wne="http://schemas.microsoft.com/office/word/2006/wordml" xmlns:wps="http://schemas.microsoft.com/office/word/2010/wordprocessingShape" mc:Ignorable="w14 w15 w16se w16cid w16 w16cex w16sdtdh w16sdtfl w16du wp14">
+  <w:abstractNum w:abstractNumId="0" w15:restartNumberingAfterBreak="0">
+    <w:nsid w:val="04F13210"/>
+    <w:multiLevelType w:val="hybridMultilevel"/>
+    <w:tmpl w:val="8D381A42"/>
+    <w:lvl w:ilvl="0" w:tplc="08090001">
+      <w:start w:val="1"/>
+      <w:numFmt w:val="bullet"/>
+      <w:lvlText w:val=""/>
+      <w:lvlJc w:val="left"/>
+      <w:pPr>
+        <w:ind w:left="720" w:hanging="360"/>
+      </w:pPr>
+      <w:rPr>
+        <w:rFonts w:ascii="Symbol" w:hAnsi="Symbol" w:hint="default"/>
+      </w:rPr>
+    </w:lvl>
+    <w:lvl w:ilvl="1" w:tplc="08090003" w:tentative="1">
+      <w:start w:val="1"/>
+      <w:numFmt w:val="bullet"/>
+      <w:lvlText w:val="o"/>
+      <w:lvlJc w:val="left"/>
+      <w:pPr>
+        <w:ind w:left="1440" w:hanging="360"/>
+      </w:pPr>
+      <w:rPr>
+        <w:rFonts w:ascii="Courier New" w:hAnsi="Courier New" w:cs="Courier New" w:hint="default"/>
+      </w:rPr>
+    </w:lvl>
+    <w:lvl w:ilvl="2" w:tplc="08090005" w:tentative="1">
+      <w:start w:val="1"/>
+      <w:numFmt w:val="bullet"/>
+      <w:lvlText w:val=""/>
+      <w:lvlJc w:val="left"/>
+      <w:pPr>
+        <w:ind w:left="2160" w:hanging="360"/>
+      </w:pPr>
+      <w:rPr>
+        <w:rFonts w:ascii="Wingdings" w:hAnsi="Wingdings" w:hint="default"/>
+      </w:rPr>
+    </w:lvl>
+    <w:lvl w:ilvl="3" w:tplc="08090001" w:tentative="1">
+      <w:start w:val="1"/>
+      <w:numFmt w:val="bullet"/>
+      <w:lvlText w:val=""/>
+      <w:lvlJc w:val="left"/>
+      <w:pPr>
+        <w:ind w:left="2880" w:hanging="360"/>
+      </w:pPr>
+      <w:rPr>
+        <w:rFonts w:ascii="Symbol" w:hAnsi="Symbol" w:hint="default"/>
+      </w:rPr>
+    </w:lvl>
+    <w:lvl w:ilvl="4" w:tplc="08090003" w:tentative="1">
+      <w:start w:val="1"/>
+      <w:numFmt w:val="bullet"/>
+      <w:lvlText w:val="o"/>
+      <w:lvlJc w:val="left"/>
+      <w:pPr>
+        <w:ind w:left="3600" w:hanging="360"/>
+      </w:pPr>
+      <w:rPr>
+        <w:rFonts w:ascii="Courier New" w:hAnsi="Courier New" w:cs="Courier New" w:hint="default"/>
+      </w:rPr>
+    </w:lvl>
+    <w:lvl w:ilvl="5" w:tplc="08090005" w:tentative="1">
+      <w:start w:val="1"/>
+      <w:numFmt w:val="bullet"/>
+      <w:lvlText w:val=""/>
+      <w:lvlJc w:val="left"/>
+      <w:pPr>
+        <w:ind w:left="4320" w:hanging="360"/>
+      </w:pPr>
+      <w:rPr>
+        <w:rFonts w:ascii="Wingdings" w:hAnsi="Wingdings" w:hint="default"/>
+      </w:rPr>
+    </w:lvl>
+    <w:lvl w:ilvl="6" w:tplc="08090001" w:tentative="1">
+      <w:start w:val="1"/>
+      <w:numFmt w:val="bullet"/>
+      <w:lvlText w:val=""/>
+      <w:lvlJc w:val="left"/>
+      <w:pPr>
+        <w:ind w:left="5040" w:hanging="360"/>
+      </w:pPr>
+      <w:rPr>
+        <w:rFonts w:ascii="Symbol" w:hAnsi="Symbol" w:hint="default"/>
+      </w:rPr>
+    </w:lvl>
+    <w:lvl w:ilvl="7" w:tplc="08090003" w:tentative="1">
+      <w:start w:val="1"/>
+      <w:numFmt w:val="bullet"/>
+      <w:lvlText w:val="o"/>
+      <w:lvlJc w:val="left"/>
+      <w:pPr>
+        <w:ind w:left="5760" w:hanging="360"/>
+      </w:pPr>
+      <w:rPr>
+        <w:rFonts w:ascii="Courier New" w:hAnsi="Courier New" w:cs="Courier New" w:hint="default"/>
+      </w:rPr>
+    </w:lvl>
+    <w:lvl w:ilvl="8" w:tplc="08090005" w:tentative="1">
+      <w:start w:val="1"/>
+      <w:numFmt w:val="bullet"/>
+      <w:lvlText w:val=""/>
+      <w:lvlJc w:val="left"/>
+      <w:pPr>
+        <w:ind w:left="6480" w:hanging="360"/>
+      </w:pPr>
+      <w:rPr>
+        <w:rFonts w:ascii="Wingdings" w:hAnsi="Wingdings" w:hint="default"/>
+      </w:rPr>
+    </w:lvl>
+  </w:abstractNum>
+  <w:num w:numId="1" w16cid:durableId="394934722">
+    <w:abstractNumId w:val="0"/>
+  </w:num>
+</w:numbering>
 </file>
 
 <file path=word/styles.xml><?xml version="1.0" encoding="utf-8"?>

</xml_diff>